<commit_message>
feat: update KPI values in task report for improved accuracy
</commit_message>
<xml_diff>
--- a/Day-10/Ibrahim/Ibrahim_Hasan_Task_Report_08June2026.docx
+++ b/Day-10/Ibrahim/Ibrahim_Hasan_Task_Report_08June2026.docx
@@ -562,31 +562,7 @@
         <w:ind w:left="360"/>
       </w:pPr>
       <w:r>
-        <w:t>• Custom Material UI Theming: Overrode default Material UI design tokens (</w:t>
-      </w:r>
-      <w:proofErr w:type="spellStart"/>
-      <w:r>
-        <w:t>MuiOutlinedInput</w:t>
-      </w:r>
-      <w:proofErr w:type="spellEnd"/>
-      <w:r>
-        <w:t xml:space="preserve">, </w:t>
-      </w:r>
-      <w:proofErr w:type="spellStart"/>
-      <w:r>
-        <w:t>MuiPaper</w:t>
-      </w:r>
-      <w:proofErr w:type="spellEnd"/>
-      <w:r>
-        <w:t xml:space="preserve">, </w:t>
-      </w:r>
-      <w:proofErr w:type="spellStart"/>
-      <w:r>
-        <w:t>MuiMenuItem</w:t>
-      </w:r>
-      <w:proofErr w:type="spellEnd"/>
-      <w:r>
-        <w:t>) to align third-party inputs perfectly with custom dark mode theme CSS variables.</w:t>
+        <w:t>• Custom Material UI Theming: Overrode default Material UI design tokens (MuiOutlinedInput, MuiPaper, MuiMenuItem) to align third-party inputs perfectly with custom dark mode theme CSS variables.</w:t>
       </w:r>
     </w:p>
     <w:p>
@@ -595,36 +571,7 @@
         <w:ind w:left="360"/>
       </w:pPr>
       <w:r>
-        <w:t xml:space="preserve">• Lightweight Native Routing: Implemented a native React-managed hash router using </w:t>
-      </w:r>
-      <w:proofErr w:type="spellStart"/>
-      <w:proofErr w:type="gramStart"/>
-      <w:r>
-        <w:t>window.location</w:t>
-      </w:r>
-      <w:proofErr w:type="gramEnd"/>
-      <w:r>
-        <w:t>.hash</w:t>
-      </w:r>
-      <w:proofErr w:type="spellEnd"/>
-      <w:r>
-        <w:t xml:space="preserve"> and </w:t>
-      </w:r>
-      <w:proofErr w:type="spellStart"/>
-      <w:r>
-        <w:t>window.addEventListener</w:t>
-      </w:r>
-      <w:proofErr w:type="spellEnd"/>
-      <w:r>
-        <w:t>('</w:t>
-      </w:r>
-      <w:proofErr w:type="spellStart"/>
-      <w:r>
-        <w:t>hashchange</w:t>
-      </w:r>
-      <w:proofErr w:type="spellEnd"/>
-      <w:r>
-        <w:t>'), avoiding bloated routing libraries while enabling deep-linking, bookmarking, and native browser back/forward navigation support.</w:t>
+        <w:t>• Lightweight Native Routing: Implemented a native React-managed hash router using window.location.hash and window.addEventListener('hashchange'), avoiding bloated routing libraries while enabling deep-linking, bookmarking, and native browser back/forward navigation support.</w:t>
       </w:r>
     </w:p>
     <w:p>
@@ -633,15 +580,7 @@
         <w:ind w:left="360"/>
       </w:pPr>
       <w:r>
-        <w:t xml:space="preserve">• Spacing &amp; Flexbox Alignment: Resolved vertical alignment mismatches between select tags, </w:t>
-      </w:r>
-      <w:proofErr w:type="spellStart"/>
-      <w:r>
-        <w:t>DatePicker</w:t>
-      </w:r>
-      <w:proofErr w:type="spellEnd"/>
-      <w:r>
-        <w:t xml:space="preserve"> inputs, and buttons by standardizing their height metric to 38px and utilizing align-items: flex-end.</w:t>
+        <w:t>• Spacing &amp; Flexbox Alignment: Resolved vertical alignment mismatches between select tags, DatePicker inputs, and buttons by standardizing their height metric to 38px and utilizing align-items: flex-end.</w:t>
       </w:r>
     </w:p>
     <w:p>
@@ -701,7 +640,19 @@
         <w:ind w:left="360"/>
       </w:pPr>
       <w:r>
-        <w:t>• KPIs &amp; SVG Summaries: Programmed four core dashboard cards showing Total Revenue ($6.58M), Total Sales (500), Avg. Mileage (66.5K miles), and Avg. Price ($13.16K), alongside visual SVG charts for brand performance.</w:t>
+        <w:t>• KPIs &amp; SVG Summaries: Programmed four core dashboard cards showing Total Revenue ($</w:t>
+      </w:r>
+      <w:r>
+        <w:t>10.96</w:t>
+      </w:r>
+      <w:r>
+        <w:t>M), Total Sales (500), and Avg. Price ($</w:t>
+      </w:r>
+      <w:r>
+        <w:t>22k</w:t>
+      </w:r>
+      <w:r>
+        <w:t>), alongside visual SVG charts for brand performance.</w:t>
       </w:r>
     </w:p>
     <w:p>
@@ -710,15 +661,7 @@
         <w:ind w:left="360"/>
       </w:pPr>
       <w:r>
-        <w:t xml:space="preserve">• Paginated &amp; Sortable Data Table: Created a custom table listing all 500 records with pagination options (10/25/50 per page) and multi-column sorting (Year, Brand, Model, Gearbox, Mileage, Price). Implemented an </w:t>
-      </w:r>
-      <w:proofErr w:type="gramStart"/>
-      <w:r>
-        <w:t>O(</w:t>
-      </w:r>
-      <w:proofErr w:type="gramEnd"/>
-      <w:r>
-        <w:t>1) indexed search badge simulating database-level B-Tree optimization.</w:t>
+        <w:t>• Paginated &amp; Sortable Data Table: Created a custom table listing all 500 records with pagination options (10/25/50 per page) and multi-column sorting (Year, Brand, Model, Gearbox, Mileage, Price). Implemented an O(1) indexed search badge simulating database-level B-Tree optimization.</w:t>
       </w:r>
     </w:p>
     <w:p>
@@ -736,15 +679,7 @@
         <w:ind w:left="360"/>
       </w:pPr>
       <w:r>
-        <w:t xml:space="preserve">• Filters: Linked date pickers (MUI </w:t>
-      </w:r>
-      <w:proofErr w:type="spellStart"/>
-      <w:r>
-        <w:t>DatePicker</w:t>
-      </w:r>
-      <w:proofErr w:type="spellEnd"/>
-      <w:r>
-        <w:t xml:space="preserve">) and dropdown filters with bottom-aligned UI positioning. </w:t>
+        <w:t xml:space="preserve">• Filters: Linked date pickers (MUI DatePicker) and dropdown filters with bottom-aligned UI positioning. </w:t>
       </w:r>
     </w:p>
     <w:p>
@@ -753,15 +688,7 @@
         <w:ind w:left="360"/>
       </w:pPr>
       <w:r>
-        <w:t xml:space="preserve">• Hamburger Navigation: Integrated mobile-responsive collapsing navigation using MUI </w:t>
-      </w:r>
-      <w:proofErr w:type="spellStart"/>
-      <w:r>
-        <w:t>IconButton</w:t>
-      </w:r>
-      <w:proofErr w:type="spellEnd"/>
-      <w:r>
-        <w:t xml:space="preserve"> and Menu components.</w:t>
+        <w:t>• Hamburger Navigation: Integrated mobile-responsive collapsing navigation using MUI IconButton and Menu components.</w:t>
       </w:r>
     </w:p>
     <w:p>
@@ -1051,23 +978,7 @@
         <w:ind w:left="360"/>
       </w:pPr>
       <w:r>
-        <w:t xml:space="preserve">• Mismatched Dimensions &amp; Styles: The native </w:t>
-      </w:r>
-      <w:proofErr w:type="gramStart"/>
-      <w:r>
-        <w:t>select</w:t>
-      </w:r>
-      <w:proofErr w:type="gramEnd"/>
-      <w:r>
-        <w:t xml:space="preserve"> dropdowns and MUI </w:t>
-      </w:r>
-      <w:proofErr w:type="spellStart"/>
-      <w:r>
-        <w:t>DatePicker</w:t>
-      </w:r>
-      <w:proofErr w:type="spellEnd"/>
-      <w:r>
-        <w:t xml:space="preserve"> fields defaulted to different heights (43px vs 38px) and fonts (Segoe UI vs Roboto), causing alignment and visual mismatches.</w:t>
+        <w:t>• Mismatched Dimensions &amp; Styles: The native select dropdowns and MUI DatePicker fields defaulted to different heights (43px vs 38px) and fonts (Segoe UI vs Roboto), causing alignment and visual mismatches.</w:t>
       </w:r>
     </w:p>
     <w:p>

</xml_diff>